<commit_message>
docs: sprint report C (M4+M5) + NEXT scoping notes
</commit_message>
<xml_diff>
--- a/NEXT.docx
+++ b/NEXT.docx
@@ -2,7 +2,7 @@
 <file path=word/document.xml><?xml version="1.0" encoding="utf-8"?>
 <w:document xmlns:w="http://schemas.openxmlformats.org/wordprocessingml/2006/main" xmlns:m="http://schemas.openxmlformats.org/officeDocument/2006/math" xmlns:r="http://schemas.openxmlformats.org/officeDocument/2006/relationships" xmlns:o="urn:schemas-microsoft-com:office:office" xmlns:v="urn:schemas-microsoft-com:vml" xmlns:w10="urn:schemas-microsoft-com:office:word" xmlns:a="http://schemas.openxmlformats.org/drawingml/2006/main" xmlns:pic="http://schemas.openxmlformats.org/drawingml/2006/picture" xmlns:wp="http://schemas.openxmlformats.org/drawingml/2006/wordprocessingDrawing">
   <w:body>
-    <w:bookmarkStart w:id="26" w:name="next-running-handoff-log-append-only"/>
+    <w:bookmarkStart w:id="31" w:name="next-running-handoff-log-append-only"/>
     <w:p>
       <w:pPr>
         <w:pStyle w:val="Heading1"/>
@@ -1344,9 +1344,841 @@
         <w:t xml:space="preserve">A3 Intelligence section (M5) and practitioner attestations.</w:t>
       </w:r>
     </w:p>
+    <w:p>
+      <w:r>
+        <w:pict>
+          <v:rect style="width:0;height:1.5pt" o:hralign="center" o:hrstd="t" o:hr="t"/>
+        </w:pict>
+      </w:r>
+    </w:p>
     <w:bookmarkEnd w:id="24"/>
     <w:bookmarkEnd w:id="25"/>
+    <w:bookmarkStart w:id="30" w:name="X9be384ad7dc010bc17b2c3af16a3063a1bcc36f"/>
+    <w:p>
+      <w:pPr>
+        <w:pStyle w:val="Heading2"/>
+      </w:pPr>
+      <w:r>
+        <w:t xml:space="preserve">Sprint C — Track B (M4–M5) · branch</w:t>
+      </w:r>
+      <w:r>
+        <w:t xml:space="preserve"> </w:t>
+      </w:r>
+      <w:r>
+        <w:rPr>
+          <w:rStyle w:val="VerbatimChar"/>
+        </w:rPr>
+        <w:t xml:space="preserve">agent/abacus-sovereign-sprint-v4</w:t>
+      </w:r>
+    </w:p>
+    <w:p>
+      <w:pPr>
+        <w:pStyle w:val="FirstParagraph"/>
+      </w:pPr>
+      <w:r>
+        <w:t xml:space="preserve">M4 (A5 intake engine + messages inbox) and M5 (A3 Intelligence section, beta)</w:t>
+      </w:r>
+      <w:r>
+        <w:t xml:space="preserve"> </w:t>
+      </w:r>
+      <w:r>
+        <w:t xml:space="preserve">built, verified, committed and pushed.</w:t>
+      </w:r>
+    </w:p>
+    <w:bookmarkStart w:id="26" w:name="Xd611086ebf9613f1e3cc769378b16851963e8d0"/>
+    <w:p>
+      <w:pPr>
+        <w:pStyle w:val="Heading3"/>
+      </w:pPr>
+      <w:r>
+        <w:t xml:space="preserve">M4 — Messages inbox + intake engine · commit</w:t>
+      </w:r>
+      <w:r>
+        <w:t xml:space="preserve"> </w:t>
+      </w:r>
+      <w:r>
+        <w:rPr>
+          <w:rStyle w:val="VerbatimChar"/>
+        </w:rPr>
+        <w:t xml:space="preserve">c6e3efa</w:t>
+      </w:r>
+    </w:p>
+    <w:p>
+      <w:pPr>
+        <w:numPr>
+          <w:ilvl w:val="0"/>
+          <w:numId w:val="1007"/>
+        </w:numPr>
+        <w:pStyle w:val="Compact"/>
+      </w:pPr>
+      <w:r>
+        <w:t xml:space="preserve">Part A: foundational intake captured through the engine, stamped at</w:t>
+      </w:r>
+      <w:r>
+        <w:t xml:space="preserve"> </w:t>
+      </w:r>
+      <w:r>
+        <w:rPr>
+          <w:bCs/>
+          <w:b/>
+        </w:rPr>
+        <w:t xml:space="preserve">L2</w:t>
+      </w:r>
+      <w:r>
+        <w:t xml:space="preserve"> </w:t>
+      </w:r>
+      <w:r>
+        <w:t xml:space="preserve">(peer-attested) + subject_id, summarized into LUCA context.</w:t>
+      </w:r>
+    </w:p>
+    <w:p>
+      <w:pPr>
+        <w:numPr>
+          <w:ilvl w:val="0"/>
+          <w:numId w:val="1007"/>
+        </w:numPr>
+        <w:pStyle w:val="Compact"/>
+      </w:pPr>
+      <w:r>
+        <w:t xml:space="preserve">Part B: intake variants/templates + prefill collapse (answered fields fold</w:t>
+      </w:r>
+      <w:r>
+        <w:t xml:space="preserve"> </w:t>
+      </w:r>
+      <w:r>
+        <w:t xml:space="preserve">into a compact recap).</w:t>
+      </w:r>
+    </w:p>
+    <w:p>
+      <w:pPr>
+        <w:numPr>
+          <w:ilvl w:val="0"/>
+          <w:numId w:val="1007"/>
+        </w:numPr>
+        <w:pStyle w:val="Compact"/>
+      </w:pPr>
+      <w:r>
+        <w:t xml:space="preserve">Bilingual EN/ES intake copy; 48h reminders for incomplete intake; messages</w:t>
+      </w:r>
+      <w:r>
+        <w:t xml:space="preserve"> </w:t>
+      </w:r>
+      <w:r>
+        <w:t xml:space="preserve">inbox surface for LUCA-initiated prompts/nudges.</w:t>
+      </w:r>
+    </w:p>
     <w:bookmarkEnd w:id="26"/>
+    <w:bookmarkStart w:id="27" w:name="X781776055ea2431d4634c2c9b560b6681a8bf7f"/>
+    <w:p>
+      <w:pPr>
+        <w:pStyle w:val="Heading3"/>
+      </w:pPr>
+      <w:r>
+        <w:t xml:space="preserve">M5 — Intelligence section (beta) · commit</w:t>
+      </w:r>
+      <w:r>
+        <w:t xml:space="preserve"> </w:t>
+      </w:r>
+      <w:r>
+        <w:rPr>
+          <w:rStyle w:val="VerbatimChar"/>
+        </w:rPr>
+        <w:t xml:space="preserve">bfdf4cd</w:t>
+      </w:r>
+    </w:p>
+    <w:p>
+      <w:pPr>
+        <w:numPr>
+          <w:ilvl w:val="0"/>
+          <w:numId w:val="1008"/>
+        </w:numPr>
+        <w:pStyle w:val="Compact"/>
+      </w:pPr>
+      <w:r>
+        <w:t xml:space="preserve">Migration</w:t>
+      </w:r>
+      <w:r>
+        <w:t xml:space="preserve"> </w:t>
+      </w:r>
+      <w:r>
+        <w:rPr>
+          <w:bCs/>
+          <w:b/>
+        </w:rPr>
+        <w:t xml:space="preserve">029</w:t>
+      </w:r>
+      <w:r>
+        <w:t xml:space="preserve"> </w:t>
+      </w:r>
+      <w:r>
+        <w:t xml:space="preserve">(additive, applied live):</w:t>
+      </w:r>
+      <w:r>
+        <w:t xml:space="preserve"> </w:t>
+      </w:r>
+      <w:r>
+        <w:rPr>
+          <w:rStyle w:val="VerbatimChar"/>
+        </w:rPr>
+        <w:t xml:space="preserve">intelligence_exclusions</w:t>
+      </w:r>
+      <w:r>
+        <w:t xml:space="preserve"> </w:t>
+      </w:r>
+      <w:r>
+        <w:t xml:space="preserve">(subject_id, excluded_source, toggled_at; UNIQUE subject+source).</w:t>
+      </w:r>
+    </w:p>
+    <w:p>
+      <w:pPr>
+        <w:numPr>
+          <w:ilvl w:val="0"/>
+          <w:numId w:val="1008"/>
+        </w:numPr>
+        <w:pStyle w:val="Compact"/>
+      </w:pPr>
+      <w:r>
+        <w:rPr>
+          <w:rStyle w:val="VerbatimChar"/>
+        </w:rPr>
+        <w:t xml:space="preserve">backend/src/lib/intelligence.js</w:t>
+      </w:r>
+      <w:r>
+        <w:t xml:space="preserve">:</w:t>
+      </w:r>
+      <w:r>
+        <w:t xml:space="preserve"> </w:t>
+      </w:r>
+      <w:r>
+        <w:rPr>
+          <w:rStyle w:val="VerbatimChar"/>
+        </w:rPr>
+        <w:t xml:space="preserve">EXCLUDABLE_SOURCES</w:t>
+      </w:r>
+      <w:r>
+        <w:t xml:space="preserve"> </w:t>
+      </w:r>
+      <w:r>
+        <w:t xml:space="preserve">(8),</w:t>
+      </w:r>
+      <w:r>
+        <w:t xml:space="preserve"> </w:t>
+      </w:r>
+      <w:r>
+        <w:rPr>
+          <w:rStyle w:val="VerbatimChar"/>
+        </w:rPr>
+        <w:t xml:space="preserve">NEVER_LIST</w:t>
+      </w:r>
+      <w:r>
+        <w:t xml:space="preserve"> </w:t>
+      </w:r>
+      <w:r>
+        <w:t xml:space="preserve">(5</w:t>
+      </w:r>
+      <w:r>
+        <w:t xml:space="preserve"> </w:t>
+      </w:r>
+      <w:r>
+        <w:t xml:space="preserve">honest boundaries),</w:t>
+      </w:r>
+      <w:r>
+        <w:t xml:space="preserve"> </w:t>
+      </w:r>
+      <w:r>
+        <w:rPr>
+          <w:rStyle w:val="VerbatimChar"/>
+        </w:rPr>
+        <w:t xml:space="preserve">getExclusions</w:t>
+      </w:r>
+      <w:r>
+        <w:t xml:space="preserve">/</w:t>
+      </w:r>
+      <w:r>
+        <w:rPr>
+          <w:rStyle w:val="VerbatimChar"/>
+        </w:rPr>
+        <w:t xml:space="preserve">setExclusion</w:t>
+      </w:r>
+      <w:r>
+        <w:t xml:space="preserve"> </w:t>
+      </w:r>
+      <w:r>
+        <w:t xml:space="preserve">keyed by subject_id.</w:t>
+      </w:r>
+    </w:p>
+    <w:p>
+      <w:pPr>
+        <w:numPr>
+          <w:ilvl w:val="0"/>
+          <w:numId w:val="1008"/>
+        </w:numPr>
+        <w:pStyle w:val="Compact"/>
+      </w:pPr>
+      <w:r>
+        <w:rPr>
+          <w:rStyle w:val="VerbatimChar"/>
+        </w:rPr>
+        <w:t xml:space="preserve">buildContext</w:t>
+      </w:r>
+      <w:r>
+        <w:t xml:space="preserve"> </w:t>
+      </w:r>
+      <w:r>
+        <w:t xml:space="preserve">refactor (</w:t>
+      </w:r>
+      <w:r>
+        <w:rPr>
+          <w:rStyle w:val="VerbatimChar"/>
+        </w:rPr>
+        <w:t xml:space="preserve">luca.js</w:t>
+      </w:r>
+      <w:r>
+        <w:t xml:space="preserve">): all 8 excludable sources emitted through</w:t>
+      </w:r>
+      <w:r>
+        <w:t xml:space="preserve"> </w:t>
+      </w:r>
+      <w:r>
+        <w:t xml:space="preserve">one</w:t>
+      </w:r>
+      <w:r>
+        <w:t xml:space="preserve"> </w:t>
+      </w:r>
+      <w:r>
+        <w:rPr>
+          <w:rStyle w:val="VerbatimChar"/>
+        </w:rPr>
+        <w:t xml:space="preserve">emit()</w:t>
+      </w:r>
+      <w:r>
+        <w:t xml:space="preserve"> </w:t>
+      </w:r>
+      <w:r>
+        <w:t xml:space="preserve">helper — always records source + count for the view, injects text</w:t>
+      </w:r>
+      <w:r>
+        <w:t xml:space="preserve"> </w:t>
+      </w:r>
+      <w:r>
+        <w:t xml:space="preserve">into the prompt only when NOT excluded. Chat handler loads exclusions first;</w:t>
+      </w:r>
+      <w:r>
+        <w:t xml:space="preserve"> </w:t>
+      </w:r>
+      <w:r>
+        <w:rPr>
+          <w:rStyle w:val="VerbatimChar"/>
+        </w:rPr>
+        <w:t xml:space="preserve">buildContext</w:t>
+      </w:r>
+      <w:r>
+        <w:t xml:space="preserve"> </w:t>
+      </w:r>
+      <w:r>
+        <w:t xml:space="preserve">exposed on the router.</w:t>
+      </w:r>
+    </w:p>
+    <w:p>
+      <w:pPr>
+        <w:numPr>
+          <w:ilvl w:val="0"/>
+          <w:numId w:val="1008"/>
+        </w:numPr>
+        <w:pStyle w:val="Compact"/>
+      </w:pPr>
+      <w:r>
+        <w:rPr>
+          <w:rStyle w:val="VerbatimChar"/>
+        </w:rPr>
+        <w:t xml:space="preserve">backend/src/routes/intelligence.js</w:t>
+      </w:r>
+      <w:r>
+        <w:t xml:space="preserve"> </w:t>
+      </w:r>
+      <w:r>
+        <w:t xml:space="preserve">mounted at</w:t>
+      </w:r>
+      <w:r>
+        <w:t xml:space="preserve"> </w:t>
+      </w:r>
+      <w:r>
+        <w:rPr>
+          <w:rStyle w:val="VerbatimChar"/>
+        </w:rPr>
+        <w:t xml:space="preserve">/api/intelligence</w:t>
+      </w:r>
+      <w:r>
+        <w:t xml:space="preserve">:</w:t>
+      </w:r>
+      <w:r>
+        <w:t xml:space="preserve"> </w:t>
+      </w:r>
+      <w:r>
+        <w:rPr>
+          <w:rStyle w:val="VerbatimChar"/>
+        </w:rPr>
+        <w:t xml:space="preserve">GET /context</w:t>
+      </w:r>
+      <w:r>
+        <w:t xml:space="preserve"> </w:t>
+      </w:r>
+      <w:r>
+        <w:t xml:space="preserve">(Natural 7 shelves + Artificial</w:t>
+      </w:r>
+      <w:r>
+        <w:t xml:space="preserve"> </w:t>
+      </w:r>
+      <w:r>
+        <w:t xml:space="preserve">“</w:t>
+      </w:r>
+      <w:r>
+        <w:t xml:space="preserve">what LUCA can see now</w:t>
+      </w:r>
+      <w:r>
+        <w:t xml:space="preserve">”</w:t>
+      </w:r>
+      <w:r>
+        <w:t xml:space="preserve"> </w:t>
+      </w:r>
+      <w:r>
+        <w:t xml:space="preserve">with</w:t>
+      </w:r>
+      <w:r>
+        <w:t xml:space="preserve"> </w:t>
+      </w:r>
+      <w:r>
+        <w:t xml:space="preserve">live counts/NEVER list/last AI call/fired rules/last 8 actions — no PHI +</w:t>
+      </w:r>
+      <w:r>
+        <w:t xml:space="preserve"> </w:t>
+      </w:r>
+      <w:r>
+        <w:t xml:space="preserve">Enhanced 4 card types),</w:t>
+      </w:r>
+      <w:r>
+        <w:t xml:space="preserve"> </w:t>
+      </w:r>
+      <w:r>
+        <w:rPr>
+          <w:rStyle w:val="VerbatimChar"/>
+        </w:rPr>
+        <w:t xml:space="preserve">GET|PUT /exclusions</w:t>
+      </w:r>
+      <w:r>
+        <w:t xml:space="preserve"> </w:t>
+      </w:r>
+      <w:r>
+        <w:t xml:space="preserve">(per-source opt-out, validated,</w:t>
+      </w:r>
+      <w:r>
+        <w:t xml:space="preserve"> </w:t>
+      </w:r>
+      <w:r>
+        <w:t xml:space="preserve">audited).</w:t>
+      </w:r>
+    </w:p>
+    <w:p>
+      <w:pPr>
+        <w:numPr>
+          <w:ilvl w:val="0"/>
+          <w:numId w:val="1008"/>
+        </w:numPr>
+        <w:pStyle w:val="Compact"/>
+      </w:pPr>
+      <w:r>
+        <w:t xml:space="preserve">Frontend:</w:t>
+      </w:r>
+      <w:r>
+        <w:t xml:space="preserve"> </w:t>
+      </w:r>
+      <w:r>
+        <w:rPr>
+          <w:bCs/>
+          <w:b/>
+        </w:rPr>
+        <w:t xml:space="preserve">Intelligence</w:t>
+      </w:r>
+      <w:r>
+        <w:t xml:space="preserve"> </w:t>
+      </w:r>
+      <w:r>
+        <w:t xml:space="preserve">tab (Salud, Brain icon);</w:t>
+      </w:r>
+      <w:r>
+        <w:t xml:space="preserve"> </w:t>
+      </w:r>
+      <w:r>
+        <w:rPr>
+          <w:rStyle w:val="VerbatimChar"/>
+        </w:rPr>
+        <w:t xml:space="preserve">IntelligencePage</w:t>
+      </w:r>
+      <w:r>
+        <w:t xml:space="preserve"> </w:t>
+      </w:r>
+      <w:r>
+        <w:t xml:space="preserve">+</w:t>
+      </w:r>
+      <w:r>
+        <w:t xml:space="preserve"> </w:t>
+      </w:r>
+      <w:r>
+        <w:rPr>
+          <w:rStyle w:val="VerbatimChar"/>
+        </w:rPr>
+        <w:t xml:space="preserve">SourceRow</w:t>
+      </w:r>
+      <w:r>
+        <w:t xml:space="preserve"> </w:t>
+      </w:r>
+      <w:r>
+        <w:t xml:space="preserve">toggles;</w:t>
+      </w:r>
+      <w:r>
+        <w:t xml:space="preserve"> </w:t>
+      </w:r>
+      <w:r>
+        <w:rPr>
+          <w:rStyle w:val="VerbatimChar"/>
+        </w:rPr>
+        <w:t xml:space="preserve">api.js</w:t>
+      </w:r>
+      <w:r>
+        <w:t xml:space="preserve"> </w:t>
+      </w:r>
+      <w:r>
+        <w:t xml:space="preserve">+3 methods.</w:t>
+      </w:r>
+    </w:p>
+    <w:p>
+      <w:pPr>
+        <w:numPr>
+          <w:ilvl w:val="0"/>
+          <w:numId w:val="1008"/>
+        </w:numPr>
+        <w:pStyle w:val="Compact"/>
+      </w:pPr>
+      <w:r>
+        <w:t xml:space="preserve">Tests:</w:t>
+      </w:r>
+      <w:r>
+        <w:t xml:space="preserve"> </w:t>
+      </w:r>
+      <w:r>
+        <w:rPr>
+          <w:rStyle w:val="VerbatimChar"/>
+        </w:rPr>
+        <w:t xml:space="preserve">intelligence.test.js</w:t>
+      </w:r>
+      <w:r>
+        <w:t xml:space="preserve"> </w:t>
+      </w:r>
+      <w:r>
+        <w:t xml:space="preserve">(+4) — 3 panes/warm empty states; no raw PHI in</w:t>
+      </w:r>
+      <w:r>
+        <w:t xml:space="preserve"> </w:t>
+      </w:r>
+      <w:r>
+        <w:t xml:space="preserve">Artificial; exclusion persists + drops source from prompt; non-excludable</w:t>
+      </w:r>
+      <w:r>
+        <w:t xml:space="preserve"> </w:t>
+      </w:r>
+      <w:r>
+        <w:t xml:space="preserve">source → 400.</w:t>
+      </w:r>
+    </w:p>
+    <w:bookmarkEnd w:id="27"/>
+    <w:bookmarkStart w:id="28" w:name="final-verification-sprint-c"/>
+    <w:p>
+      <w:pPr>
+        <w:pStyle w:val="Heading3"/>
+      </w:pPr>
+      <w:r>
+        <w:t xml:space="preserve">Final verification (Sprint C)</w:t>
+      </w:r>
+    </w:p>
+    <w:p>
+      <w:pPr>
+        <w:numPr>
+          <w:ilvl w:val="0"/>
+          <w:numId w:val="1009"/>
+        </w:numPr>
+        <w:pStyle w:val="Compact"/>
+      </w:pPr>
+      <w:r>
+        <w:t xml:space="preserve">Backend</w:t>
+      </w:r>
+      <w:r>
+        <w:t xml:space="preserve"> </w:t>
+      </w:r>
+      <w:r>
+        <w:rPr>
+          <w:rStyle w:val="VerbatimChar"/>
+        </w:rPr>
+        <w:t xml:space="preserve">npx jest --silent</w:t>
+      </w:r>
+      <w:r>
+        <w:t xml:space="preserve"> </w:t>
+      </w:r>
+      <w:r>
+        <w:rPr>
+          <w:bCs/>
+          <w:b/>
+        </w:rPr>
+        <w:t xml:space="preserve">161/161</w:t>
+      </w:r>
+      <w:r>
+        <w:t xml:space="preserve"> </w:t>
+      </w:r>
+      <w:r>
+        <w:t xml:space="preserve">(+4); frontend</w:t>
+      </w:r>
+      <w:r>
+        <w:t xml:space="preserve"> </w:t>
+      </w:r>
+      <w:r>
+        <w:rPr>
+          <w:rStyle w:val="VerbatimChar"/>
+        </w:rPr>
+        <w:t xml:space="preserve">npx vitest run</w:t>
+      </w:r>
+      <w:r>
+        <w:t xml:space="preserve"> </w:t>
+      </w:r>
+      <w:r>
+        <w:rPr>
+          <w:bCs/>
+          <w:b/>
+        </w:rPr>
+        <w:t xml:space="preserve">32/32</w:t>
+      </w:r>
+      <w:r>
+        <w:t xml:space="preserve">;</w:t>
+      </w:r>
+      <w:r>
+        <w:t xml:space="preserve"> </w:t>
+      </w:r>
+      <w:r>
+        <w:rPr>
+          <w:rStyle w:val="VerbatimChar"/>
+        </w:rPr>
+        <w:t xml:space="preserve">npx vite build</w:t>
+      </w:r>
+      <w:r>
+        <w:t xml:space="preserve"> </w:t>
+      </w:r>
+      <w:r>
+        <w:t xml:space="preserve">clean; roundtrip 9/9. Migrations current through</w:t>
+      </w:r>
+      <w:r>
+        <w:t xml:space="preserve"> </w:t>
+      </w:r>
+      <w:r>
+        <w:rPr>
+          <w:bCs/>
+          <w:b/>
+        </w:rPr>
+        <w:t xml:space="preserve">029</w:t>
+      </w:r>
+      <w:r>
+        <w:t xml:space="preserve">.</w:t>
+      </w:r>
+      <w:r>
+        <w:t xml:space="preserve"> </w:t>
+      </w:r>
+      <w:r>
+        <w:rPr>
+          <w:rStyle w:val="VerbatimChar"/>
+        </w:rPr>
+        <w:t xml:space="preserve">public/sw.js</w:t>
+      </w:r>
+      <w:r>
+        <w:t xml:space="preserve"> </w:t>
+      </w:r>
+      <w:r>
+        <w:rPr>
+          <w:bCs/>
+          <w:b/>
+        </w:rPr>
+        <w:t xml:space="preserve">solaris-v9 → solaris-v10</w:t>
+      </w:r>
+      <w:r>
+        <w:t xml:space="preserve">. Docker rebuilt + up;</w:t>
+      </w:r>
+      <w:r>
+        <w:t xml:space="preserve"> </w:t>
+      </w:r>
+      <w:r>
+        <w:rPr>
+          <w:rStyle w:val="VerbatimChar"/>
+        </w:rPr>
+        <w:t xml:space="preserve">/api/health</w:t>
+      </w:r>
+      <w:r>
+        <w:t xml:space="preserve"> </w:t>
+      </w:r>
+      <w:r>
+        <w:t xml:space="preserve">ok. Live site 200;</w:t>
+      </w:r>
+      <w:r>
+        <w:t xml:space="preserve"> </w:t>
+      </w:r>
+      <w:r>
+        <w:rPr>
+          <w:rStyle w:val="VerbatimChar"/>
+        </w:rPr>
+        <w:t xml:space="preserve">/api/intelligence/context</w:t>
+      </w:r>
+      <w:r>
+        <w:t xml:space="preserve"> </w:t>
+      </w:r>
+      <w:r>
+        <w:t xml:space="preserve">returns 3 panes</w:t>
+      </w:r>
+      <w:r>
+        <w:t xml:space="preserve"> </w:t>
+      </w:r>
+      <w:r>
+        <w:t xml:space="preserve">with real counts; exclusion toggle verified via live API + in-browser.</w:t>
+      </w:r>
+    </w:p>
+    <w:bookmarkEnd w:id="28"/>
+    <w:bookmarkStart w:id="29" w:name="follow-ups-deferred-1"/>
+    <w:p>
+      <w:pPr>
+        <w:pStyle w:val="Heading3"/>
+      </w:pPr>
+      <w:r>
+        <w:t xml:space="preserve">Follow-ups / deferred</w:t>
+      </w:r>
+    </w:p>
+    <w:p>
+      <w:pPr>
+        <w:numPr>
+          <w:ilvl w:val="0"/>
+          <w:numId w:val="1010"/>
+        </w:numPr>
+        <w:pStyle w:val="Compact"/>
+      </w:pPr>
+      <w:r>
+        <w:rPr>
+          <w:bCs/>
+          <w:b/>
+        </w:rPr>
+        <w:t xml:space="preserve">A3 §4.1 mandatory four provenance columns — full rollout DEFERRED.</w:t>
+      </w:r>
+      <w:r>
+        <w:t xml:space="preserve"> </w:t>
+      </w:r>
+      <w:r>
+        <w:t xml:space="preserve">Present</w:t>
+      </w:r>
+      <w:r>
+        <w:t xml:space="preserve"> </w:t>
+      </w:r>
+      <w:r>
+        <w:t xml:space="preserve">on</w:t>
+      </w:r>
+      <w:r>
+        <w:t xml:space="preserve"> </w:t>
+      </w:r>
+      <w:r>
+        <w:rPr>
+          <w:rStyle w:val="VerbatimChar"/>
+        </w:rPr>
+        <w:t xml:space="preserve">health_documents</w:t>
+      </w:r>
+      <w:r>
+        <w:t xml:space="preserve"> </w:t>
+      </w:r>
+      <w:r>
+        <w:t xml:space="preserve">(M3) + foundational/intake tables (M4); NOT yet on</w:t>
+      </w:r>
+      <w:r>
+        <w:t xml:space="preserve"> </w:t>
+      </w:r>
+      <w:r>
+        <w:rPr>
+          <w:rStyle w:val="VerbatimChar"/>
+        </w:rPr>
+        <w:t xml:space="preserve">daily_checkins</w:t>
+      </w:r>
+      <w:r>
+        <w:t xml:space="preserve"> </w:t>
+      </w:r>
+      <w:r>
+        <w:t xml:space="preserve">/</w:t>
+      </w:r>
+      <w:r>
+        <w:t xml:space="preserve"> </w:t>
+      </w:r>
+      <w:r>
+        <w:rPr>
+          <w:rStyle w:val="VerbatimChar"/>
+        </w:rPr>
+        <w:t xml:space="preserve">journal_entries</w:t>
+      </w:r>
+      <w:r>
+        <w:t xml:space="preserve"> </w:t>
+      </w:r>
+      <w:r>
+        <w:t xml:space="preserve">— documented as beta scoping. Intelligence</w:t>
+      </w:r>
+      <w:r>
+        <w:t xml:space="preserve"> </w:t>
+      </w:r>
+      <w:r>
+        <w:t xml:space="preserve">view shows best-available provenance per shelf meanwhile.</w:t>
+      </w:r>
+    </w:p>
+    <w:p>
+      <w:pPr>
+        <w:numPr>
+          <w:ilvl w:val="0"/>
+          <w:numId w:val="1010"/>
+        </w:numPr>
+        <w:pStyle w:val="Compact"/>
+      </w:pPr>
+      <w:r>
+        <w:t xml:space="preserve">Enhanced patterns are simple 7-day averages (hedged; need ≥3 check-ins).</w:t>
+      </w:r>
+    </w:p>
+    <w:p>
+      <w:pPr>
+        <w:numPr>
+          <w:ilvl w:val="0"/>
+          <w:numId w:val="1010"/>
+        </w:numPr>
+        <w:pStyle w:val="Compact"/>
+      </w:pPr>
+      <w:r>
+        <w:t xml:space="preserve">Artificial recentActions capped at last 8 receipts (metadata only, no PHI).</w:t>
+      </w:r>
+    </w:p>
+    <w:p>
+      <w:pPr>
+        <w:numPr>
+          <w:ilvl w:val="0"/>
+          <w:numId w:val="1010"/>
+        </w:numPr>
+        <w:pStyle w:val="Compact"/>
+      </w:pPr>
+      <w:r>
+        <w:t xml:space="preserve">Remaining Track B milestones (A4 Wompi/GPS, A2 §3 Nostr binding) not started</w:t>
+      </w:r>
+      <w:r>
+        <w:t xml:space="preserve"> </w:t>
+      </w:r>
+      <w:r>
+        <w:t xml:space="preserve">— separate later subtasks.</w:t>
+      </w:r>
+    </w:p>
+    <w:bookmarkEnd w:id="29"/>
+    <w:bookmarkEnd w:id="30"/>
+    <w:bookmarkEnd w:id="31"/>
     <w:sectPr/>
   </w:body>
 </w:document>
@@ -1548,6 +2380,18 @@
     <w:abstractNumId w:val="991"/>
   </w:num>
   <w:num w:numId="1006">
+    <w:abstractNumId w:val="991"/>
+  </w:num>
+  <w:num w:numId="1007">
+    <w:abstractNumId w:val="991"/>
+  </w:num>
+  <w:num w:numId="1008">
+    <w:abstractNumId w:val="991"/>
+  </w:num>
+  <w:num w:numId="1009">
+    <w:abstractNumId w:val="991"/>
+  </w:num>
+  <w:num w:numId="1010">
     <w:abstractNumId w:val="991"/>
   </w:num>
 </w:numbering>

</xml_diff>

<commit_message>
docs: Sprint E report (quality hardening) + NEXT log; sw v12
Service worker cache solaris-v11 -> solaris-v12. Appends Sprint E section to
docs/ABACUS_SPRINT_REPORT.md and NEXT.md covering items 0-8, final validation
(183/32/9, build clean, site 200, /api/health ok), and the seed-image rebuild
gotcha.
</commit_message>
<xml_diff>
--- a/NEXT.docx
+++ b/NEXT.docx
@@ -2,7 +2,7 @@
 <file path=word/document.xml><?xml version="1.0" encoding="utf-8"?>
 <w:document xmlns:w="http://schemas.openxmlformats.org/wordprocessingml/2006/main" xmlns:m="http://schemas.openxmlformats.org/officeDocument/2006/math" xmlns:r="http://schemas.openxmlformats.org/officeDocument/2006/relationships" xmlns:o="urn:schemas-microsoft-com:office:office" xmlns:v="urn:schemas-microsoft-com:vml" xmlns:w10="urn:schemas-microsoft-com:office:word" xmlns:a="http://schemas.openxmlformats.org/drawingml/2006/main" xmlns:pic="http://schemas.openxmlformats.org/drawingml/2006/picture" xmlns:wp="http://schemas.openxmlformats.org/drawingml/2006/wordprocessingDrawing">
   <w:body>
-    <w:bookmarkStart w:id="31" w:name="next-running-handoff-log-append-only"/>
+    <w:bookmarkStart w:id="40" w:name="next-running-handoff-log-append-only"/>
     <w:p>
       <w:pPr>
         <w:pStyle w:val="Heading1"/>
@@ -2178,7 +2178,1561 @@
     </w:p>
     <w:bookmarkEnd w:id="29"/>
     <w:bookmarkEnd w:id="30"/>
+    <w:bookmarkStart w:id="36" w:name="X0bee1e62b2ce2811bf71a5c18df3af2635aee55"/>
+    <w:p>
+      <w:pPr>
+        <w:pStyle w:val="Heading2"/>
+      </w:pPr>
+      <w:r>
+        <w:t xml:space="preserve">Sprint D — Track B (M6–M8) · branch</w:t>
+      </w:r>
+      <w:r>
+        <w:t xml:space="preserve"> </w:t>
+      </w:r>
+      <w:r>
+        <w:rPr>
+          <w:rStyle w:val="VerbatimChar"/>
+        </w:rPr>
+        <w:t xml:space="preserve">agent/abacus-sovereign-sprint-v4</w:t>
+      </w:r>
+    </w:p>
+    <w:p>
+      <w:pPr>
+        <w:pStyle w:val="FirstParagraph"/>
+      </w:pPr>
+      <w:r>
+        <w:t xml:space="preserve">Sovereign payments + GPS shadow receipts + working Identity Key (Nostr).</w:t>
+      </w:r>
+      <w:r>
+        <w:t xml:space="preserve"> </w:t>
+      </w:r>
+      <w:r>
+        <w:t xml:space="preserve">Commit+push after every milestone.</w:t>
+      </w:r>
+    </w:p>
+    <w:bookmarkStart w:id="31" w:name="X64d4c15077251ab09d96e2cc33110e60ebb3481"/>
+    <w:p>
+      <w:pPr>
+        <w:pStyle w:val="Heading3"/>
+      </w:pPr>
+      <w:r>
+        <w:t xml:space="preserve">M6 — Payments MVP (Wompi sandbox) · commit</w:t>
+      </w:r>
+      <w:r>
+        <w:t xml:space="preserve"> </w:t>
+      </w:r>
+      <w:r>
+        <w:rPr>
+          <w:rStyle w:val="VerbatimChar"/>
+        </w:rPr>
+        <w:t xml:space="preserve">7d4b4f7</w:t>
+      </w:r>
+    </w:p>
+    <w:p>
+      <w:pPr>
+        <w:numPr>
+          <w:ilvl w:val="0"/>
+          <w:numId w:val="1011"/>
+        </w:numPr>
+        <w:pStyle w:val="Compact"/>
+      </w:pPr>
+      <w:r>
+        <w:t xml:space="preserve">PaymentProvider port + Wompi-sandbox/mock adapters; idempotent webhook;</w:t>
+      </w:r>
+      <w:r>
+        <w:t xml:space="preserve"> </w:t>
+      </w:r>
+      <w:r>
+        <w:t xml:space="preserve">A4 allocation ledger (</w:t>
+      </w:r>
+      <w:r>
+        <w:rPr>
+          <w:rStyle w:val="VerbatimChar"/>
+        </w:rPr>
+        <w:t xml:space="preserve">lib/payments/allocation-policy.js</w:t>
+      </w:r>
+      <w:r>
+        <w:t xml:space="preserve">,</w:t>
+      </w:r>
+      <w:r>
+        <w:t xml:space="preserve"> </w:t>
+      </w:r>
+      <w:r>
+        <w:rPr>
+          <w:rStyle w:val="VerbatimChar"/>
+        </w:rPr>
+        <w:t xml:space="preserve">gps:policy:aura-consultation:v0.1</w:t>
+      </w:r>
+      <w:r>
+        <w:t xml:space="preserve">; earned 9000 = aura 8600 + coord 400;</w:t>
+      </w:r>
+      <w:r>
+        <w:t xml:space="preserve"> </w:t>
+      </w:r>
+      <w:r>
+        <w:t xml:space="preserve">envelope 1000 bps four buckets; largest-remainder; no referral leg); inbox</w:t>
+      </w:r>
+      <w:r>
+        <w:t xml:space="preserve"> </w:t>
+      </w:r>
+      <w:r>
+        <w:t xml:space="preserve">receipt. Migration 030. Backend 164/164.</w:t>
+      </w:r>
+    </w:p>
     <w:bookmarkEnd w:id="31"/>
+    <w:bookmarkStart w:id="32" w:name="m7-gps-shadow-receipts-commit-877c3f7"/>
+    <w:p>
+      <w:pPr>
+        <w:pStyle w:val="Heading3"/>
+      </w:pPr>
+      <w:r>
+        <w:t xml:space="preserve">M7 — GPS shadow receipts · commit</w:t>
+      </w:r>
+      <w:r>
+        <w:t xml:space="preserve"> </w:t>
+      </w:r>
+      <w:r>
+        <w:rPr>
+          <w:rStyle w:val="VerbatimChar"/>
+        </w:rPr>
+        <w:t xml:space="preserve">877c3f7</w:t>
+      </w:r>
+    </w:p>
+    <w:p>
+      <w:pPr>
+        <w:numPr>
+          <w:ilvl w:val="0"/>
+          <w:numId w:val="1012"/>
+        </w:numPr>
+        <w:pStyle w:val="Compact"/>
+      </w:pPr>
+      <w:r>
+        <w:t xml:space="preserve">Migration 031</w:t>
+      </w:r>
+      <w:r>
+        <w:t xml:space="preserve"> </w:t>
+      </w:r>
+      <w:r>
+        <w:rPr>
+          <w:rStyle w:val="VerbatimChar"/>
+        </w:rPr>
+        <w:t xml:space="preserve">gps_shadow_receipts</w:t>
+      </w:r>
+      <w:r>
+        <w:t xml:space="preserve">.</w:t>
+      </w:r>
+      <w:r>
+        <w:t xml:space="preserve"> </w:t>
+      </w:r>
+      <w:r>
+        <w:rPr>
+          <w:rStyle w:val="VerbatimChar"/>
+        </w:rPr>
+        <w:t xml:space="preserve">lib/gps-shadow.js</w:t>
+      </w:r>
+      <w:r>
+        <w:t xml:space="preserve"> </w:t>
+      </w:r>
+      <w:r>
+        <w:t xml:space="preserve">builds</w:t>
+      </w:r>
+      <w:r>
+        <w:t xml:space="preserve"> </w:t>
+      </w:r>
+      <w:r>
+        <w:rPr>
+          <w:rStyle w:val="VerbatimChar"/>
+        </w:rPr>
+        <w:t xml:space="preserve">gps-receipt/1.0</w:t>
+      </w:r>
+      <w:r>
+        <w:t xml:space="preserve"> </w:t>
+      </w:r>
+      <w:r>
+        <w:t xml:space="preserve">(A4 §3.4), invariants enforced, idempotent, SCHEDULED ≥ $500.</w:t>
+      </w:r>
+      <w:r>
+        <w:t xml:space="preserve"> </w:t>
+      </w:r>
+      <w:r>
+        <w:rPr>
+          <w:rStyle w:val="VerbatimChar"/>
+        </w:rPr>
+        <w:t xml:space="preserve">GET /api/gps/receipts(/:id)</w:t>
+      </w:r>
+      <w:r>
+        <w:t xml:space="preserve">; vault</w:t>
+      </w:r>
+      <w:r>
+        <w:t xml:space="preserve"> </w:t>
+      </w:r>
+      <w:r>
+        <w:rPr>
+          <w:rStyle w:val="VerbatimChar"/>
+        </w:rPr>
+        <w:t xml:space="preserve">payments/gps-receipts.jsonl</w:t>
+      </w:r>
+      <w:r>
+        <w:t xml:space="preserve">; member</w:t>
+      </w:r>
+      <w:r>
+        <w:t xml:space="preserve"> </w:t>
+      </w:r>
+      <w:r>
+        <w:t xml:space="preserve">panel</w:t>
+      </w:r>
+      <w:r>
+        <w:t xml:space="preserve"> </w:t>
+      </w:r>
+      <w:r>
+        <w:rPr>
+          <w:rStyle w:val="VerbatimChar"/>
+        </w:rPr>
+        <w:t xml:space="preserve">PaymentReceipts.jsx</w:t>
+      </w:r>
+      <w:r>
+        <w:t xml:space="preserve">. Backend 166/166, frontend 32/32, roundtrip 9/9.</w:t>
+      </w:r>
+    </w:p>
+    <w:bookmarkEnd w:id="32"/>
+    <w:bookmarkStart w:id="33" w:name="X3038ccda28791724cdc849d64f4f9d51a70e826"/>
+    <w:p>
+      <w:pPr>
+        <w:pStyle w:val="Heading3"/>
+      </w:pPr>
+      <w:r>
+        <w:t xml:space="preserve">M8 — Identity Key (Nostr) + NIP-05 + login · commit</w:t>
+      </w:r>
+      <w:r>
+        <w:t xml:space="preserve"> </w:t>
+      </w:r>
+      <w:r>
+        <w:rPr>
+          <w:rStyle w:val="VerbatimChar"/>
+        </w:rPr>
+        <w:t xml:space="preserve">31100df</w:t>
+      </w:r>
+    </w:p>
+    <w:p>
+      <w:pPr>
+        <w:numPr>
+          <w:ilvl w:val="0"/>
+          <w:numId w:val="1013"/>
+        </w:numPr>
+        <w:pStyle w:val="Compact"/>
+      </w:pPr>
+      <w:r>
+        <w:t xml:space="preserve">Client-side BIP-39 → NIP-06 npub (</w:t>
+      </w:r>
+      <w:r>
+        <w:rPr>
+          <w:rStyle w:val="VerbatimChar"/>
+        </w:rPr>
+        <w:t xml:space="preserve">src/lib/identity-key.js</w:t>
+      </w:r>
+      <w:r>
+        <w:t xml:space="preserve">); nsec in</w:t>
+      </w:r>
+      <w:r>
+        <w:t xml:space="preserve"> </w:t>
+      </w:r>
+      <w:r>
+        <w:t xml:space="preserve">sessionStorage only, never sent up.</w:t>
+      </w:r>
+      <w:r>
+        <w:t xml:space="preserve"> </w:t>
+      </w:r>
+      <w:r>
+        <w:rPr>
+          <w:rStyle w:val="VerbatimChar"/>
+        </w:rPr>
+        <w:t xml:space="preserve">POST /api/identity/nostr</w:t>
+      </w:r>
+      <w:r>
+        <w:t xml:space="preserve"> </w:t>
+      </w:r>
+      <w:r>
+        <w:t xml:space="preserve">stores public</w:t>
+      </w:r>
+      <w:r>
+        <w:t xml:space="preserve"> </w:t>
+      </w:r>
+      <w:r>
+        <w:t xml:space="preserve">npub + NIP-05 handle (migration 032</w:t>
+      </w:r>
+      <w:r>
+        <w:t xml:space="preserve"> </w:t>
+      </w:r>
+      <w:r>
+        <w:rPr>
+          <w:rStyle w:val="VerbatimChar"/>
+        </w:rPr>
+        <w:t xml:space="preserve">nostr_handles</w:t>
+      </w:r>
+      <w:r>
+        <w:t xml:space="preserve">). Working challenge/response</w:t>
+      </w:r>
+      <w:r>
+        <w:t xml:space="preserve"> </w:t>
+      </w:r>
+      <w:r>
+        <w:t xml:space="preserve">login:</w:t>
+      </w:r>
+      <w:r>
+        <w:t xml:space="preserve"> </w:t>
+      </w:r>
+      <w:r>
+        <w:rPr>
+          <w:rStyle w:val="VerbatimChar"/>
+        </w:rPr>
+        <w:t xml:space="preserve">/api/auth/nostr/challenge</w:t>
+      </w:r>
+      <w:r>
+        <w:t xml:space="preserve"> </w:t>
+      </w:r>
+      <w:r>
+        <w:t xml:space="preserve">(single-use 5-min nonce) +</w:t>
+      </w:r>
+      <w:r>
+        <w:t xml:space="preserve"> </w:t>
+      </w:r>
+      <w:r>
+        <w:rPr>
+          <w:rStyle w:val="VerbatimChar"/>
+        </w:rPr>
+        <w:t xml:space="preserve">/api/auth/nostr/login</w:t>
+      </w:r>
+      <w:r>
+        <w:t xml:space="preserve"> </w:t>
+      </w:r>
+      <w:r>
+        <w:t xml:space="preserve">(BIP-340 Schnorr verify → JWT).</w:t>
+      </w:r>
+      <w:r>
+        <w:t xml:space="preserve"> </w:t>
+      </w:r>
+      <w:r>
+        <w:rPr>
+          <w:rStyle w:val="VerbatimChar"/>
+        </w:rPr>
+        <w:t xml:space="preserve">flows/Auth.jsx</w:t>
+      </w:r>
+      <w:r>
+        <w:t xml:space="preserve"> </w:t>
+      </w:r>
+      <w:r>
+        <w:t xml:space="preserve">now has</w:t>
+      </w:r>
+      <w:r>
+        <w:t xml:space="preserve"> </w:t>
+      </w:r>
+      <w:r>
+        <w:t xml:space="preserve">a real create/existing Identity Key flow (replaced</w:t>
+      </w:r>
+      <w:r>
+        <w:t xml:space="preserve"> </w:t>
+      </w:r>
+      <w:r>
+        <w:t xml:space="preserve">“</w:t>
+      </w:r>
+      <w:r>
+        <w:t xml:space="preserve">coming soon</w:t>
+      </w:r>
+      <w:r>
+        <w:t xml:space="preserve">”</w:t>
+      </w:r>
+      <w:r>
+        <w:t xml:space="preserve">).</w:t>
+      </w:r>
+      <w:r>
+        <w:t xml:space="preserve"> </w:t>
+      </w:r>
+      <w:r>
+        <w:rPr>
+          <w:rStyle w:val="VerbatimChar"/>
+        </w:rPr>
+        <w:t xml:space="preserve">.well-known/nostr.json</w:t>
+      </w:r>
+      <w:r>
+        <w:t xml:space="preserve"> </w:t>
+      </w:r>
+      <w:r>
+        <w:t xml:space="preserve">resolves handle→pubkey; lnurlp returns</w:t>
+      </w:r>
+      <w:r>
+        <w:t xml:space="preserve"> </w:t>
+      </w:r>
+      <w:r>
+        <w:t xml:space="preserve">“</w:t>
+      </w:r>
+      <w:r>
+        <w:t xml:space="preserve">not configured</w:t>
+      </w:r>
+      <w:r>
+        <w:t xml:space="preserve">”</w:t>
+      </w:r>
+      <w:r>
+        <w:t xml:space="preserve">.</w:t>
+      </w:r>
+      <w:r>
+        <w:t xml:space="preserve"> </w:t>
+      </w:r>
+      <w:r>
+        <w:t xml:space="preserve">Renamed</w:t>
+      </w:r>
+      <w:r>
+        <w:t xml:space="preserve"> </w:t>
+      </w:r>
+      <w:r>
+        <w:t xml:space="preserve">“</w:t>
+      </w:r>
+      <w:r>
+        <w:t xml:space="preserve">Nostr</w:t>
+      </w:r>
+      <w:r>
+        <w:t xml:space="preserve">”</w:t>
+      </w:r>
+      <w:r>
+        <w:t xml:space="preserve"> </w:t>
+      </w:r>
+      <w:r>
+        <w:t xml:space="preserve">→</w:t>
+      </w:r>
+      <w:r>
+        <w:t xml:space="preserve"> </w:t>
+      </w:r>
+      <w:r>
+        <w:t xml:space="preserve">“</w:t>
+      </w:r>
+      <w:r>
+        <w:t xml:space="preserve">Identity Key</w:t>
+      </w:r>
+      <w:r>
+        <w:t xml:space="preserve">”</w:t>
+      </w:r>
+      <w:r>
+        <w:t xml:space="preserve"> </w:t>
+      </w:r>
+      <w:r>
+        <w:t xml:space="preserve">in UI + ℹ️ info popover with exact sovereignty</w:t>
+      </w:r>
+      <w:r>
+        <w:t xml:space="preserve"> </w:t>
+      </w:r>
+      <w:r>
+        <w:t xml:space="preserve">copy;</w:t>
+      </w:r>
+      <w:r>
+        <w:t xml:space="preserve"> </w:t>
+      </w:r>
+      <w:r>
+        <w:rPr>
+          <w:rStyle w:val="VerbatimChar"/>
+        </w:rPr>
+        <w:t xml:space="preserve">IdentityCard</w:t>
+      </w:r>
+      <w:r>
+        <w:t xml:space="preserve"> </w:t>
+      </w:r>
+      <w:r>
+        <w:t xml:space="preserve">generate/bind flow. Fixed latent M7</w:t>
+      </w:r>
+      <w:r>
+        <w:t xml:space="preserve"> </w:t>
+      </w:r>
+      <w:r>
+        <w:rPr>
+          <w:rStyle w:val="VerbatimChar"/>
+        </w:rPr>
+        <w:t xml:space="preserve">PaymentReceipts</w:t>
+      </w:r>
+      <w:r>
+        <w:t xml:space="preserve"> </w:t>
+      </w:r>
+      <w:r>
+        <w:t xml:space="preserve">import</w:t>
+      </w:r>
+      <w:r>
+        <w:t xml:space="preserve"> </w:t>
+      </w:r>
+      <w:r>
+        <w:t xml:space="preserve">build bug. Backend 170/170 (+4), frontend 32/32, roundtrip 9/9, vite build clean.</w:t>
+      </w:r>
+    </w:p>
+    <w:bookmarkEnd w:id="33"/>
+    <w:bookmarkStart w:id="34" w:name="final-verification-sprint-d"/>
+    <w:p>
+      <w:pPr>
+        <w:pStyle w:val="Heading3"/>
+      </w:pPr>
+      <w:r>
+        <w:t xml:space="preserve">Final verification (Sprint D)</w:t>
+      </w:r>
+    </w:p>
+    <w:p>
+      <w:pPr>
+        <w:numPr>
+          <w:ilvl w:val="0"/>
+          <w:numId w:val="1014"/>
+        </w:numPr>
+        <w:pStyle w:val="Compact"/>
+      </w:pPr>
+      <w:r>
+        <w:t xml:space="preserve">Migrations through 032.</w:t>
+      </w:r>
+      <w:r>
+        <w:t xml:space="preserve"> </w:t>
+      </w:r>
+      <w:r>
+        <w:rPr>
+          <w:rStyle w:val="VerbatimChar"/>
+        </w:rPr>
+        <w:t xml:space="preserve">sw.js</w:t>
+      </w:r>
+      <w:r>
+        <w:t xml:space="preserve"> </w:t>
+      </w:r>
+      <w:r>
+        <w:t xml:space="preserve">solaris-v10 →</w:t>
+      </w:r>
+      <w:r>
+        <w:t xml:space="preserve"> </w:t>
+      </w:r>
+      <w:r>
+        <w:rPr>
+          <w:bCs/>
+          <w:b/>
+        </w:rPr>
+        <w:t xml:space="preserve">v11</w:t>
+      </w:r>
+      <w:r>
+        <w:t xml:space="preserve">. Docker rebuilt + up;</w:t>
+      </w:r>
+      <w:r>
+        <w:t xml:space="preserve"> </w:t>
+      </w:r>
+      <w:r>
+        <w:rPr>
+          <w:rStyle w:val="VerbatimChar"/>
+        </w:rPr>
+        <w:t xml:space="preserve">/api/health</w:t>
+      </w:r>
+      <w:r>
+        <w:t xml:space="preserve"> </w:t>
+      </w:r>
+      <w:r>
+        <w:t xml:space="preserve">ok; live site 200. Live E2E: create → challenge → sign → login</w:t>
+      </w:r>
+      <w:r>
+        <w:t xml:space="preserve"> </w:t>
+      </w:r>
+      <w:r>
+        <w:t xml:space="preserve">200 + JWT → bind npub+handle →</w:t>
+      </w:r>
+      <w:r>
+        <w:t xml:space="preserve"> </w:t>
+      </w:r>
+      <w:r>
+        <w:rPr>
+          <w:rStyle w:val="VerbatimChar"/>
+        </w:rPr>
+        <w:t xml:space="preserve">nostr.json</w:t>
+      </w:r>
+      <w:r>
+        <w:t xml:space="preserve"> </w:t>
+      </w:r>
+      <w:r>
+        <w:t xml:space="preserve">resolves → lnurlp</w:t>
+      </w:r>
+      <w:r>
+        <w:t xml:space="preserve"> </w:t>
+      </w:r>
+      <w:r>
+        <w:t xml:space="preserve">“</w:t>
+      </w:r>
+      <w:r>
+        <w:t xml:space="preserve">not configured</w:t>
+      </w:r>
+      <w:r>
+        <w:t xml:space="preserve">”</w:t>
+      </w:r>
+      <w:r>
+        <w:t xml:space="preserve">.</w:t>
+      </w:r>
+      <w:r>
+        <w:t xml:space="preserve"> </w:t>
+      </w:r>
+      <w:r>
+        <w:t xml:space="preserve">nginx</w:t>
+      </w:r>
+      <w:r>
+        <w:t xml:space="preserve"> </w:t>
+      </w:r>
+      <w:r>
+        <w:rPr>
+          <w:rStyle w:val="VerbatimChar"/>
+        </w:rPr>
+        <w:t xml:space="preserve">/.well-known/</w:t>
+      </w:r>
+      <w:r>
+        <w:t xml:space="preserve"> </w:t>
+      </w:r>
+      <w:r>
+        <w:t xml:space="preserve">proxied to backend. Test data cleaned up. Tag</w:t>
+      </w:r>
+      <w:r>
+        <w:t xml:space="preserve"> </w:t>
+      </w:r>
+      <w:r>
+        <w:rPr>
+          <w:rStyle w:val="VerbatimChar"/>
+        </w:rPr>
+        <w:t xml:space="preserve">sprint-d-complete</w:t>
+      </w:r>
+      <w:r>
+        <w:t xml:space="preserve">.</w:t>
+      </w:r>
+    </w:p>
+    <w:bookmarkEnd w:id="34"/>
+    <w:bookmarkStart w:id="35" w:name="follow-ups-deferred-2"/>
+    <w:p>
+      <w:pPr>
+        <w:pStyle w:val="Heading3"/>
+      </w:pPr>
+      <w:r>
+        <w:t xml:space="preserve">Follow-ups / deferred</w:t>
+      </w:r>
+    </w:p>
+    <w:p>
+      <w:pPr>
+        <w:numPr>
+          <w:ilvl w:val="0"/>
+          <w:numId w:val="1015"/>
+        </w:numPr>
+        <w:pStyle w:val="Compact"/>
+      </w:pPr>
+      <w:r>
+        <w:t xml:space="preserve">Signing is direct (nsec in sessionStorage), not NIP-46 bunker (A2 §3.2.4 ideal;</w:t>
+      </w:r>
+      <w:r>
+        <w:t xml:space="preserve"> </w:t>
+      </w:r>
+      <w:r>
+        <w:t xml:space="preserve">scope note says ship NIP-05 + npub first). Key never leaves device.</w:t>
+      </w:r>
+    </w:p>
+    <w:p>
+      <w:pPr>
+        <w:numPr>
+          <w:ilvl w:val="0"/>
+          <w:numId w:val="1015"/>
+        </w:numPr>
+        <w:pStyle w:val="Compact"/>
+      </w:pPr>
+      <w:r>
+        <w:t xml:space="preserve">Payments/GPS settlement simulated (Wompi sandbox; allocations SIMULATED).</w:t>
+      </w:r>
+      <w:r>
+        <w:t xml:space="preserve"> </w:t>
+      </w:r>
+      <w:r>
+        <w:t xml:space="preserve">Lightning address returns</w:t>
+      </w:r>
+      <w:r>
+        <w:t xml:space="preserve"> </w:t>
+      </w:r>
+      <w:r>
+        <w:t xml:space="preserve">“</w:t>
+      </w:r>
+      <w:r>
+        <w:t xml:space="preserve">not configured</w:t>
+      </w:r>
+      <w:r>
+        <w:t xml:space="preserve">”</w:t>
+      </w:r>
+      <w:r>
+        <w:t xml:space="preserve">.</w:t>
+      </w:r>
+    </w:p>
+    <w:p>
+      <w:pPr>
+        <w:numPr>
+          <w:ilvl w:val="0"/>
+          <w:numId w:val="1015"/>
+        </w:numPr>
+        <w:pStyle w:val="Compact"/>
+      </w:pPr>
+      <w:r>
+        <w:t xml:space="preserve">A4 payments policy runs alongside the legacy</w:t>
+      </w:r>
+      <w:r>
+        <w:t xml:space="preserve"> </w:t>
+      </w:r>
+      <w:r>
+        <w:rPr>
+          <w:rStyle w:val="VerbatimChar"/>
+        </w:rPr>
+        <w:t xml:space="preserve">lib/gps</w:t>
+      </w:r>
+      <w:r>
+        <w:t xml:space="preserve"> </w:t>
+      </w:r>
+      <w:r>
+        <w:t xml:space="preserve">engine; not merged.</w:t>
+      </w:r>
+    </w:p>
+    <w:p>
+      <w:r>
+        <w:pict>
+          <v:rect style="width:0;height:1.5pt" o:hralign="center" o:hrstd="t" o:hr="t"/>
+        </w:pict>
+      </w:r>
+    </w:p>
+    <w:bookmarkEnd w:id="35"/>
+    <w:bookmarkEnd w:id="36"/>
+    <w:bookmarkStart w:id="39" w:name="sprint-e-quality-hardening"/>
+    <w:p>
+      <w:pPr>
+        <w:pStyle w:val="Heading2"/>
+      </w:pPr>
+      <w:r>
+        <w:t xml:space="preserve">Sprint E — Quality Hardening</w:t>
+      </w:r>
+    </w:p>
+    <w:p>
+      <w:pPr>
+        <w:pStyle w:val="FirstParagraph"/>
+      </w:pPr>
+      <w:r>
+        <w:t xml:space="preserve">Nine items closing production-readiness gaps from a live-demo walkthrough</w:t>
+      </w:r>
+      <w:r>
+        <w:t xml:space="preserve"> </w:t>
+      </w:r>
+      <w:r>
+        <w:t xml:space="preserve">(branch</w:t>
+      </w:r>
+      <w:r>
+        <w:t xml:space="preserve"> </w:t>
+      </w:r>
+      <w:r>
+        <w:rPr>
+          <w:rStyle w:val="VerbatimChar"/>
+        </w:rPr>
+        <w:t xml:space="preserve">agent/abacus-sovereign-sprint-v4</w:t>
+      </w:r>
+      <w:r>
+        <w:t xml:space="preserve">, one commit + push per item):</w:t>
+      </w:r>
+    </w:p>
+    <w:p>
+      <w:pPr>
+        <w:numPr>
+          <w:ilvl w:val="0"/>
+          <w:numId w:val="1016"/>
+        </w:numPr>
+        <w:pStyle w:val="Compact"/>
+      </w:pPr>
+      <w:r>
+        <w:rPr>
+          <w:bCs/>
+          <w:b/>
+        </w:rPr>
+        <w:t xml:space="preserve">0</w:t>
+      </w:r>
+      <w:r>
+        <w:t xml:space="preserve"> </w:t>
+      </w:r>
+      <w:r>
+        <w:t xml:space="preserve">Identity Key login button contrast — solid green + white text.</w:t>
+      </w:r>
+      <w:r>
+        <w:t xml:space="preserve"> </w:t>
+      </w:r>
+      <w:r>
+        <w:rPr>
+          <w:rStyle w:val="VerbatimChar"/>
+        </w:rPr>
+        <w:t xml:space="preserve">bd56b1a</w:t>
+      </w:r>
+    </w:p>
+    <w:p>
+      <w:pPr>
+        <w:numPr>
+          <w:ilvl w:val="0"/>
+          <w:numId w:val="1016"/>
+        </w:numPr>
+        <w:pStyle w:val="Compact"/>
+      </w:pPr>
+      <w:r>
+        <w:rPr>
+          <w:bCs/>
+          <w:b/>
+        </w:rPr>
+        <w:t xml:space="preserve">1</w:t>
+      </w:r>
+      <w:r>
+        <w:t xml:space="preserve"> </w:t>
+      </w:r>
+      <w:r>
+        <w:t xml:space="preserve">Postgres-backed rate-limit store (mig 033); preserves</w:t>
+      </w:r>
+      <w:r>
+        <w:t xml:space="preserve"> </w:t>
+      </w:r>
+      <w:r>
+        <w:rPr>
+          <w:rStyle w:val="VerbatimChar"/>
+        </w:rPr>
+        <w:t xml:space="preserve">trust proxy=2</w:t>
+      </w:r>
+      <w:r>
+        <w:t xml:space="preserve"> </w:t>
+      </w:r>
+      <w:r>
+        <w:t xml:space="preserve">+</w:t>
+      </w:r>
+      <w:r>
+        <w:t xml:space="preserve"> </w:t>
+      </w:r>
+      <w:r>
+        <w:t xml:space="preserve">failed-attempts-only keying; test-mode memory fallback.</w:t>
+      </w:r>
+      <w:r>
+        <w:t xml:space="preserve"> </w:t>
+      </w:r>
+      <w:r>
+        <w:rPr>
+          <w:rStyle w:val="VerbatimChar"/>
+        </w:rPr>
+        <w:t xml:space="preserve">0c84c19</w:t>
+      </w:r>
+    </w:p>
+    <w:p>
+      <w:pPr>
+        <w:numPr>
+          <w:ilvl w:val="0"/>
+          <w:numId w:val="1016"/>
+        </w:numPr>
+        <w:pStyle w:val="Compact"/>
+      </w:pPr>
+      <w:r>
+        <w:rPr>
+          <w:bCs/>
+          <w:b/>
+        </w:rPr>
+        <w:t xml:space="preserve">2</w:t>
+      </w:r>
+      <w:r>
+        <w:t xml:space="preserve"> </w:t>
+      </w:r>
+      <w:r>
+        <w:t xml:space="preserve">Email adapter (Resend/SMTP/console), bilingual ES/EN, lazy nodemailer.</w:t>
+      </w:r>
+      <w:r>
+        <w:t xml:space="preserve"> </w:t>
+      </w:r>
+      <w:r>
+        <w:rPr>
+          <w:rStyle w:val="VerbatimChar"/>
+        </w:rPr>
+        <w:t xml:space="preserve">18a0726</w:t>
+      </w:r>
+    </w:p>
+    <w:p>
+      <w:pPr>
+        <w:numPr>
+          <w:ilvl w:val="0"/>
+          <w:numId w:val="1016"/>
+        </w:numPr>
+        <w:pStyle w:val="Compact"/>
+      </w:pPr>
+      <w:r>
+        <w:rPr>
+          <w:bCs/>
+          <w:b/>
+        </w:rPr>
+        <w:t xml:space="preserve">3</w:t>
+      </w:r>
+      <w:r>
+        <w:t xml:space="preserve"> </w:t>
+      </w:r>
+      <w:r>
+        <w:t xml:space="preserve">GPS shadow-receipt demo data — 3 SETTLED + 2 SCHEDULED, idempotent.</w:t>
+      </w:r>
+      <w:r>
+        <w:t xml:space="preserve"> </w:t>
+      </w:r>
+      <w:r>
+        <w:rPr>
+          <w:rStyle w:val="VerbatimChar"/>
+        </w:rPr>
+        <w:t xml:space="preserve">769c27c</w:t>
+      </w:r>
+    </w:p>
+    <w:p>
+      <w:pPr>
+        <w:numPr>
+          <w:ilvl w:val="0"/>
+          <w:numId w:val="1016"/>
+        </w:numPr>
+        <w:pStyle w:val="Compact"/>
+      </w:pPr>
+      <w:r>
+        <w:rPr>
+          <w:bCs/>
+          <w:b/>
+        </w:rPr>
+        <w:t xml:space="preserve">4</w:t>
+      </w:r>
+      <w:r>
+        <w:t xml:space="preserve"> </w:t>
+      </w:r>
+      <w:r>
+        <w:t xml:space="preserve">Provenance rollout (mig 034) to</w:t>
+      </w:r>
+      <w:r>
+        <w:t xml:space="preserve"> </w:t>
+      </w:r>
+      <w:r>
+        <w:rPr>
+          <w:rStyle w:val="VerbatimChar"/>
+        </w:rPr>
+        <w:t xml:space="preserve">daily_checkins</w:t>
+      </w:r>
+      <w:r>
+        <w:t xml:space="preserve"> </w:t>
+      </w:r>
+      <w:r>
+        <w:t xml:space="preserve">+</w:t>
+      </w:r>
+      <w:r>
+        <w:t xml:space="preserve"> </w:t>
+      </w:r>
+      <w:r>
+        <w:rPr>
+          <w:rStyle w:val="VerbatimChar"/>
+        </w:rPr>
+        <w:t xml:space="preserve">journal_entries</w:t>
+      </w:r>
+      <w:r>
+        <w:t xml:space="preserve">;</w:t>
+      </w:r>
+      <w:r>
+        <w:t xml:space="preserve"> </w:t>
+      </w:r>
+      <w:r>
+        <w:t xml:space="preserve">Natural shelves show real source·level·date.</w:t>
+      </w:r>
+      <w:r>
+        <w:t xml:space="preserve"> </w:t>
+      </w:r>
+      <w:r>
+        <w:rPr>
+          <w:rStyle w:val="VerbatimChar"/>
+        </w:rPr>
+        <w:t xml:space="preserve">3e63b08</w:t>
+      </w:r>
+    </w:p>
+    <w:p>
+      <w:pPr>
+        <w:numPr>
+          <w:ilvl w:val="0"/>
+          <w:numId w:val="1016"/>
+        </w:numPr>
+        <w:pStyle w:val="Compact"/>
+      </w:pPr>
+      <w:r>
+        <w:rPr>
+          <w:bCs/>
+          <w:b/>
+        </w:rPr>
+        <w:t xml:space="preserve">5</w:t>
+      </w:r>
+      <w:r>
+        <w:t xml:space="preserve"> </w:t>
+      </w:r>
+      <w:r>
+        <w:t xml:space="preserve">Booking payment UI (mig 035) —</w:t>
+      </w:r>
+      <w:r>
+        <w:t xml:space="preserve"> </w:t>
+      </w:r>
+      <w:r>
+        <w:rPr>
+          <w:rStyle w:val="VerbatimChar"/>
+        </w:rPr>
+        <w:t xml:space="preserve">payment_intents.booking_id</w:t>
+      </w:r>
+      <w:r>
+        <w:t xml:space="preserve"> </w:t>
+      </w:r>
+      <w:r>
+        <w:t xml:space="preserve">+</w:t>
+      </w:r>
+      <w:r>
+        <w:t xml:space="preserve"> </w:t>
+      </w:r>
+      <w:r>
+        <w:rPr>
+          <w:rStyle w:val="VerbatimChar"/>
+        </w:rPr>
+        <w:t xml:space="preserve">bookings.payment_status</w:t>
+      </w:r>
+      <w:r>
+        <w:t xml:space="preserve">;</w:t>
+      </w:r>
+      <w:r>
+        <w:t xml:space="preserve"> </w:t>
+      </w:r>
+      <w:r>
+        <w:rPr>
+          <w:rStyle w:val="VerbatimChar"/>
+        </w:rPr>
+        <w:t xml:space="preserve">/checkout</w:t>
+      </w:r>
+      <w:r>
+        <w:t xml:space="preserve"> </w:t>
+      </w:r>
+      <w:r>
+        <w:t xml:space="preserve">takes</w:t>
+      </w:r>
+      <w:r>
+        <w:t xml:space="preserve"> </w:t>
+      </w:r>
+      <w:r>
+        <w:rPr>
+          <w:rStyle w:val="VerbatimChar"/>
+        </w:rPr>
+        <w:t xml:space="preserve">bookingId</w:t>
+      </w:r>
+      <w:r>
+        <w:t xml:space="preserve">, derives amount,</w:t>
+      </w:r>
+      <w:r>
+        <w:t xml:space="preserve"> </w:t>
+      </w:r>
+      <w:r>
+        <w:t xml:space="preserve">validates ownership, marks pending→paid on webhook; BookingFlow</w:t>
+      </w:r>
+      <w:r>
+        <w:t xml:space="preserve"> </w:t>
+      </w:r>
+      <w:r>
+        <w:t xml:space="preserve">“</w:t>
+      </w:r>
+      <w:r>
+        <w:t xml:space="preserve">Pay to</w:t>
+      </w:r>
+      <w:r>
+        <w:t xml:space="preserve"> </w:t>
+      </w:r>
+      <w:r>
+        <w:t xml:space="preserve">confirm</w:t>
+      </w:r>
+      <w:r>
+        <w:t xml:space="preserve">”</w:t>
+      </w:r>
+      <w:r>
+        <w:t xml:space="preserve"> </w:t>
+      </w:r>
+      <w:r>
+        <w:t xml:space="preserve">+ BookingCard pills (Wompi sandbox).</w:t>
+      </w:r>
+      <w:r>
+        <w:t xml:space="preserve"> </w:t>
+      </w:r>
+      <w:r>
+        <w:rPr>
+          <w:rStyle w:val="VerbatimChar"/>
+        </w:rPr>
+        <w:t xml:space="preserve">23ef111</w:t>
+      </w:r>
+    </w:p>
+    <w:p>
+      <w:pPr>
+        <w:numPr>
+          <w:ilvl w:val="0"/>
+          <w:numId w:val="1016"/>
+        </w:numPr>
+        <w:pStyle w:val="Compact"/>
+      </w:pPr>
+      <w:r>
+        <w:rPr>
+          <w:bCs/>
+          <w:b/>
+        </w:rPr>
+        <w:t xml:space="preserve">6</w:t>
+      </w:r>
+      <w:r>
+        <w:t xml:space="preserve"> </w:t>
+      </w:r>
+      <w:r>
+        <w:t xml:space="preserve">Demo gaps —</w:t>
+      </w:r>
+      <w:r>
+        <w:t xml:space="preserve"> </w:t>
+      </w:r>
+      <w:r>
+        <w:rPr>
+          <w:rStyle w:val="VerbatimChar"/>
+        </w:rPr>
+        <w:t xml:space="preserve">seedAlejandroProfile()</w:t>
+      </w:r>
+      <w:r>
+        <w:t xml:space="preserve"> </w:t>
+      </w:r>
+      <w:r>
+        <w:t xml:space="preserve">(bookable integrative-nutrition</w:t>
+      </w:r>
+      <w:r>
+        <w:t xml:space="preserve"> </w:t>
+      </w:r>
+      <w:r>
+        <w:t xml:space="preserve">profile: 3 services, Mon/Wed/Fri slots → appears in Explore + Curate) and</w:t>
+      </w:r>
+      <w:r>
+        <w:t xml:space="preserve"> </w:t>
+      </w:r>
+      <w:r>
+        <w:rPr>
+          <w:rStyle w:val="VerbatimChar"/>
+        </w:rPr>
+        <w:t xml:space="preserve">seedSarahAssessment()</w:t>
+      </w:r>
+      <w:r>
+        <w:t xml:space="preserve"> </w:t>
+      </w:r>
+      <w:r>
+        <w:t xml:space="preserve">(3 historical snapshots 30/60/90d → real vitality trend</w:t>
+      </w:r>
+      <w:r>
+        <w:t xml:space="preserve"> </w:t>
+      </w:r>
+      <w:r>
+        <w:t xml:space="preserve">line, plus answer backfill). Idempotent;</w:t>
+      </w:r>
+      <w:r>
+        <w:t xml:space="preserve"> </w:t>
+      </w:r>
+      <w:r>
+        <w:rPr>
+          <w:rStyle w:val="VerbatimChar"/>
+        </w:rPr>
+        <w:t xml:space="preserve">--demo-gaps</w:t>
+      </w:r>
+      <w:r>
+        <w:t xml:space="preserve"> </w:t>
+      </w:r>
+      <w:r>
+        <w:t xml:space="preserve">flag + full seed.</w:t>
+      </w:r>
+      <w:r>
+        <w:t xml:space="preserve"> </w:t>
+      </w:r>
+      <w:r>
+        <w:rPr>
+          <w:rStyle w:val="VerbatimChar"/>
+        </w:rPr>
+        <w:t xml:space="preserve">78abac9</w:t>
+      </w:r>
+    </w:p>
+    <w:p>
+      <w:pPr>
+        <w:numPr>
+          <w:ilvl w:val="0"/>
+          <w:numId w:val="1016"/>
+        </w:numPr>
+        <w:pStyle w:val="Compact"/>
+      </w:pPr>
+      <w:r>
+        <w:rPr>
+          <w:bCs/>
+          <w:b/>
+        </w:rPr>
+        <w:t xml:space="preserve">7</w:t>
+      </w:r>
+      <w:r>
+        <w:t xml:space="preserve"> </w:t>
+      </w:r>
+      <w:r>
+        <w:t xml:space="preserve">Identity Key flow UX — verified complete (bundled into item 0).</w:t>
+      </w:r>
+    </w:p>
+    <w:p>
+      <w:pPr>
+        <w:numPr>
+          <w:ilvl w:val="0"/>
+          <w:numId w:val="1016"/>
+        </w:numPr>
+        <w:pStyle w:val="Compact"/>
+      </w:pPr>
+      <w:r>
+        <w:rPr>
+          <w:bCs/>
+          <w:b/>
+        </w:rPr>
+        <w:t xml:space="preserve">8</w:t>
+      </w:r>
+      <w:r>
+        <w:t xml:space="preserve"> </w:t>
+      </w:r>
+      <w:r>
+        <w:t xml:space="preserve">Mobile — check-in sliders ≥44px touch target; Intelligence panes</w:t>
+      </w:r>
+      <w:r>
+        <w:t xml:space="preserve"> </w:t>
+      </w:r>
+      <w:r>
+        <w:rPr>
+          <w:rStyle w:val="VerbatimChar"/>
+        </w:rPr>
+        <w:t xml:space="preserve">minmax(min(320|280px,100%),1fr)</w:t>
+      </w:r>
+      <w:r>
+        <w:t xml:space="preserve"> </w:t>
+      </w:r>
+      <w:r>
+        <w:t xml:space="preserve">(no ≤375px overflow); booking modal padding</w:t>
+      </w:r>
+    </w:p>
+    <w:p>
+      <w:pPr>
+        <w:numPr>
+          <w:ilvl w:val="1"/>
+          <w:numId w:val="1017"/>
+        </w:numPr>
+        <w:pStyle w:val="Compact"/>
+      </w:pPr>
+      <w:r>
+        <w:t xml:space="preserve">96vh at ≤520px.</w:t>
+      </w:r>
+      <w:r>
+        <w:t xml:space="preserve"> </w:t>
+      </w:r>
+      <w:r>
+        <w:rPr>
+          <w:rStyle w:val="VerbatimChar"/>
+        </w:rPr>
+        <w:t xml:space="preserve">e7b072a</w:t>
+      </w:r>
+    </w:p>
+    <w:bookmarkStart w:id="37" w:name="final-verification-sprint-e"/>
+    <w:p>
+      <w:pPr>
+        <w:pStyle w:val="Heading3"/>
+      </w:pPr>
+      <w:r>
+        <w:t xml:space="preserve">Final verification (Sprint E)</w:t>
+      </w:r>
+    </w:p>
+    <w:p>
+      <w:pPr>
+        <w:numPr>
+          <w:ilvl w:val="0"/>
+          <w:numId w:val="1018"/>
+        </w:numPr>
+        <w:pStyle w:val="Compact"/>
+      </w:pPr>
+      <w:r>
+        <w:t xml:space="preserve">Migrations through</w:t>
+      </w:r>
+      <w:r>
+        <w:t xml:space="preserve"> </w:t>
+      </w:r>
+      <w:r>
+        <w:rPr>
+          <w:bCs/>
+          <w:b/>
+        </w:rPr>
+        <w:t xml:space="preserve">035</w:t>
+      </w:r>
+      <w:r>
+        <w:t xml:space="preserve">.</w:t>
+      </w:r>
+      <w:r>
+        <w:t xml:space="preserve"> </w:t>
+      </w:r>
+      <w:r>
+        <w:rPr>
+          <w:rStyle w:val="VerbatimChar"/>
+        </w:rPr>
+        <w:t xml:space="preserve">sw.js</w:t>
+      </w:r>
+      <w:r>
+        <w:t xml:space="preserve"> </w:t>
+      </w:r>
+      <w:r>
+        <w:t xml:space="preserve">solaris-v11 →</w:t>
+      </w:r>
+      <w:r>
+        <w:t xml:space="preserve"> </w:t>
+      </w:r>
+      <w:r>
+        <w:rPr>
+          <w:bCs/>
+          <w:b/>
+        </w:rPr>
+        <w:t xml:space="preserve">v12</w:t>
+      </w:r>
+      <w:r>
+        <w:t xml:space="preserve">.</w:t>
+      </w:r>
+    </w:p>
+    <w:p>
+      <w:pPr>
+        <w:numPr>
+          <w:ilvl w:val="0"/>
+          <w:numId w:val="1018"/>
+        </w:numPr>
+        <w:pStyle w:val="Compact"/>
+      </w:pPr>
+      <w:r>
+        <w:t xml:space="preserve">Backend</w:t>
+      </w:r>
+      <w:r>
+        <w:t xml:space="preserve"> </w:t>
+      </w:r>
+      <w:r>
+        <w:rPr>
+          <w:bCs/>
+          <w:b/>
+        </w:rPr>
+        <w:t xml:space="preserve">183/183</w:t>
+      </w:r>
+      <w:r>
+        <w:t xml:space="preserve">, frontend</w:t>
+      </w:r>
+      <w:r>
+        <w:t xml:space="preserve"> </w:t>
+      </w:r>
+      <w:r>
+        <w:rPr>
+          <w:bCs/>
+          <w:b/>
+        </w:rPr>
+        <w:t xml:space="preserve">32/32</w:t>
+      </w:r>
+      <w:r>
+        <w:t xml:space="preserve">, roundtrip</w:t>
+      </w:r>
+      <w:r>
+        <w:t xml:space="preserve"> </w:t>
+      </w:r>
+      <w:r>
+        <w:rPr>
+          <w:bCs/>
+          <w:b/>
+        </w:rPr>
+        <w:t xml:space="preserve">9/9</w:t>
+      </w:r>
+      <w:r>
+        <w:t xml:space="preserve">, vite build clean.</w:t>
+      </w:r>
+    </w:p>
+    <w:p>
+      <w:pPr>
+        <w:numPr>
+          <w:ilvl w:val="0"/>
+          <w:numId w:val="1018"/>
+        </w:numPr>
+        <w:pStyle w:val="Compact"/>
+      </w:pPr>
+      <w:r>
+        <w:t xml:space="preserve">Docker frontend+backend+seed rebuilt;</w:t>
+      </w:r>
+      <w:r>
+        <w:t xml:space="preserve"> </w:t>
+      </w:r>
+      <w:r>
+        <w:rPr>
+          <w:rStyle w:val="VerbatimChar"/>
+        </w:rPr>
+        <w:t xml:space="preserve">up -d</w:t>
+      </w:r>
+      <w:r>
+        <w:t xml:space="preserve">;</w:t>
+      </w:r>
+      <w:r>
+        <w:t xml:space="preserve"> </w:t>
+      </w:r>
+      <w:r>
+        <w:rPr>
+          <w:rStyle w:val="VerbatimChar"/>
+        </w:rPr>
+        <w:t xml:space="preserve">/api/health</w:t>
+      </w:r>
+      <w:r>
+        <w:t xml:space="preserve"> </w:t>
+      </w:r>
+      <w:r>
+        <w:t xml:space="preserve">ok; live site 200.</w:t>
+      </w:r>
+    </w:p>
+    <w:p>
+      <w:pPr>
+        <w:numPr>
+          <w:ilvl w:val="0"/>
+          <w:numId w:val="1018"/>
+        </w:numPr>
+        <w:pStyle w:val="Compact"/>
+      </w:pPr>
+      <w:r>
+        <w:t xml:space="preserve">Verified live: alejandro bookable (active/approved, 3 services/3 slots); sarah</w:t>
+      </w:r>
+      <w:r>
+        <w:t xml:space="preserve"> </w:t>
+      </w:r>
+      <w:r>
+        <w:t xml:space="preserve">has 4 trending responses (vitality 55→60→63→67).</w:t>
+      </w:r>
+    </w:p>
+    <w:bookmarkEnd w:id="37"/>
+    <w:bookmarkStart w:id="38" w:name="gotcha"/>
+    <w:p>
+      <w:pPr>
+        <w:pStyle w:val="Heading3"/>
+      </w:pPr>
+      <w:r>
+        <w:t xml:space="preserve">Gotcha</w:t>
+      </w:r>
+    </w:p>
+    <w:p>
+      <w:pPr>
+        <w:numPr>
+          <w:ilvl w:val="0"/>
+          <w:numId w:val="1019"/>
+        </w:numPr>
+        <w:pStyle w:val="Compact"/>
+      </w:pPr>
+      <w:r>
+        <w:t xml:space="preserve">The</w:t>
+      </w:r>
+      <w:r>
+        <w:t xml:space="preserve"> </w:t>
+      </w:r>
+      <w:r>
+        <w:rPr>
+          <w:rStyle w:val="VerbatimChar"/>
+        </w:rPr>
+        <w:t xml:space="preserve">seed</w:t>
+      </w:r>
+      <w:r>
+        <w:t xml:space="preserve"> </w:t>
+      </w:r>
+      <w:r>
+        <w:t xml:space="preserve">compose service runs a</w:t>
+      </w:r>
+      <w:r>
+        <w:t xml:space="preserve"> </w:t>
+      </w:r>
+      <w:r>
+        <w:rPr>
+          <w:bCs/>
+          <w:b/>
+        </w:rPr>
+        <w:t xml:space="preserve">full reset</w:t>
+      </w:r>
+      <w:r>
+        <w:t xml:space="preserve"> </w:t>
+      </w:r>
+      <w:r>
+        <w:t xml:space="preserve">on every</w:t>
+      </w:r>
+      <w:r>
+        <w:t xml:space="preserve"> </w:t>
+      </w:r>
+      <w:r>
+        <w:rPr>
+          <w:rStyle w:val="VerbatimChar"/>
+        </w:rPr>
+        <w:t xml:space="preserve">up</w:t>
+      </w:r>
+      <w:r>
+        <w:t xml:space="preserve">. It now includes</w:t>
+      </w:r>
+      <w:r>
+        <w:t xml:space="preserve"> </w:t>
+      </w:r>
+      <w:r>
+        <w:t xml:space="preserve">the item-6 demo-gap functions, but the</w:t>
+      </w:r>
+      <w:r>
+        <w:t xml:space="preserve"> </w:t>
+      </w:r>
+      <w:r>
+        <w:rPr>
+          <w:rStyle w:val="VerbatimChar"/>
+        </w:rPr>
+        <w:t xml:space="preserve">seed</w:t>
+      </w:r>
+      <w:r>
+        <w:t xml:space="preserve"> </w:t>
+      </w:r>
+      <w:r>
+        <w:t xml:space="preserve">image must be rebuilt with</w:t>
+      </w:r>
+      <w:r>
+        <w:t xml:space="preserve"> </w:t>
+      </w:r>
+      <w:r>
+        <w:rPr>
+          <w:rStyle w:val="VerbatimChar"/>
+        </w:rPr>
+        <w:t xml:space="preserve">backend</w:t>
+      </w:r>
+      <w:r>
+        <w:t xml:space="preserve">/</w:t>
+      </w:r>
+      <w:r>
+        <w:rPr>
+          <w:rStyle w:val="VerbatimChar"/>
+        </w:rPr>
+        <w:t xml:space="preserve">frontend</w:t>
+      </w:r>
+      <w:r>
+        <w:t xml:space="preserve"> </w:t>
+      </w:r>
+      <w:r>
+        <w:t xml:space="preserve">— a stale seed image wipes the demo-gap data (hit + fixed</w:t>
+      </w:r>
+      <w:r>
+        <w:t xml:space="preserve"> </w:t>
+      </w:r>
+      <w:r>
+        <w:t xml:space="preserve">during deploy by rebuilding</w:t>
+      </w:r>
+      <w:r>
+        <w:t xml:space="preserve"> </w:t>
+      </w:r>
+      <w:r>
+        <w:rPr>
+          <w:rStyle w:val="VerbatimChar"/>
+        </w:rPr>
+        <w:t xml:space="preserve">seed</w:t>
+      </w:r>
+      <w:r>
+        <w:t xml:space="preserve"> </w:t>
+      </w:r>
+      <w:r>
+        <w:t xml:space="preserve">and re-running</w:t>
+      </w:r>
+      <w:r>
+        <w:t xml:space="preserve"> </w:t>
+      </w:r>
+      <w:r>
+        <w:rPr>
+          <w:rStyle w:val="VerbatimChar"/>
+        </w:rPr>
+        <w:t xml:space="preserve">--demo-gaps</w:t>
+      </w:r>
+      <w:r>
+        <w:t xml:space="preserve">).</w:t>
+      </w:r>
+    </w:p>
+    <w:bookmarkEnd w:id="38"/>
+    <w:bookmarkEnd w:id="39"/>
+    <w:bookmarkEnd w:id="40"/>
     <w:sectPr/>
   </w:body>
 </w:document>
@@ -2392,6 +3946,33 @@
     <w:abstractNumId w:val="991"/>
   </w:num>
   <w:num w:numId="1010">
+    <w:abstractNumId w:val="991"/>
+  </w:num>
+  <w:num w:numId="1011">
+    <w:abstractNumId w:val="991"/>
+  </w:num>
+  <w:num w:numId="1012">
+    <w:abstractNumId w:val="991"/>
+  </w:num>
+  <w:num w:numId="1013">
+    <w:abstractNumId w:val="991"/>
+  </w:num>
+  <w:num w:numId="1014">
+    <w:abstractNumId w:val="991"/>
+  </w:num>
+  <w:num w:numId="1015">
+    <w:abstractNumId w:val="991"/>
+  </w:num>
+  <w:num w:numId="1016">
+    <w:abstractNumId w:val="991"/>
+  </w:num>
+  <w:num w:numId="1017">
+    <w:abstractNumId w:val="991"/>
+  </w:num>
+  <w:num w:numId="1018">
+    <w:abstractNumId w:val="991"/>
+  </w:num>
+  <w:num w:numId="1019">
     <w:abstractNumId w:val="991"/>
   </w:num>
 </w:numbering>

</xml_diff>